<commit_message>
profile1 css first update
</commit_message>
<xml_diff>
--- a/studentInfo.docx
+++ b/studentInfo.docx
@@ -419,6 +419,14 @@
                 <w:color w:val="000000" w:themeColor="text1"/>
               </w:rPr>
             </w:pPr>
+            <w:r>
+              <w:rPr>
+                <w:b/>
+                <w:bCs/>
+                <w:color w:val="000000" w:themeColor="text1"/>
+              </w:rPr>
+              <w:t>JACKLINE VALENTINO KADEHA</w:t>
+            </w:r>
           </w:p>
         </w:tc>
         <w:tc>
@@ -441,6 +449,15 @@
                 <w:color w:val="000000" w:themeColor="text1"/>
               </w:rPr>
             </w:pPr>
+            <w:r>
+              <w:rPr>
+                <w:rFonts w:ascii="Times New Roman" w:hAnsi="Times New Roman" w:cs="Times New Roman"/>
+                <w:b/>
+                <w:bCs/>
+                <w:color w:val="000000" w:themeColor="text1"/>
+              </w:rPr>
+              <w:t>2025-04-03155</w:t>
+            </w:r>
           </w:p>
         </w:tc>
       </w:tr>
@@ -502,12 +519,12 @@
             </w:pPr>
             <w:r>
               <w:rPr>
-                <w:rFonts w:ascii="Times New Roman" w:eastAsia="Times New Roman" w:hAnsi="Times New Roman" w:cs="Times New Roman"/>
-                <w:b/>
-                <w:bCs/>
-                <w:color w:val="000000" w:themeColor="text1"/>
-              </w:rPr>
-              <w:t>ABUBAKARY OMARY NDAMUNGU</w:t>
+                <w:rFonts w:ascii="Times New Roman" w:hAnsi="Times New Roman" w:cs="Times New Roman"/>
+                <w:b/>
+                <w:bCs/>
+                <w:color w:val="000000" w:themeColor="text1"/>
+              </w:rPr>
+              <w:t>BAHATI GEORGE JAMES</w:t>
             </w:r>
           </w:p>
         </w:tc>
@@ -533,12 +550,12 @@
             </w:pPr>
             <w:r>
               <w:rPr>
-                <w:rFonts w:ascii="Times New Roman" w:eastAsia="Times New Roman" w:hAnsi="Times New Roman" w:cs="Times New Roman"/>
-                <w:b/>
-                <w:bCs/>
-                <w:color w:val="000000" w:themeColor="text1"/>
-              </w:rPr>
-              <w:t>2025-04-08565</w:t>
+                <w:rFonts w:ascii="Times New Roman" w:hAnsi="Times New Roman" w:cs="Times New Roman"/>
+                <w:b/>
+                <w:bCs/>
+                <w:color w:val="000000" w:themeColor="text1"/>
+              </w:rPr>
+              <w:t>2025-04-02658</w:t>
             </w:r>
           </w:p>
         </w:tc>
@@ -599,6 +616,15 @@
                 <w:color w:val="000000" w:themeColor="text1"/>
               </w:rPr>
             </w:pPr>
+            <w:r>
+              <w:rPr>
+                <w:rFonts w:ascii="Times New Roman" w:eastAsia="Times New Roman" w:hAnsi="Times New Roman" w:cs="Times New Roman"/>
+                <w:b/>
+                <w:bCs/>
+                <w:color w:val="000000" w:themeColor="text1"/>
+              </w:rPr>
+              <w:t>JOSEPH MENARD MHEMA</w:t>
+            </w:r>
           </w:p>
         </w:tc>
         <w:tc>
@@ -621,6 +647,15 @@
                 <w:color w:val="000000" w:themeColor="text1"/>
               </w:rPr>
             </w:pPr>
+            <w:r>
+              <w:rPr>
+                <w:rFonts w:ascii="Times New Roman" w:eastAsia="Times New Roman" w:hAnsi="Times New Roman" w:cs="Times New Roman"/>
+                <w:b/>
+                <w:bCs/>
+                <w:color w:val="000000" w:themeColor="text1"/>
+              </w:rPr>
+              <w:t>2025-04-06530</w:t>
+            </w:r>
           </w:p>
         </w:tc>
       </w:tr>
@@ -680,6 +715,26 @@
                 <w:color w:val="000000" w:themeColor="text1"/>
               </w:rPr>
             </w:pPr>
+            <w:r>
+              <w:rPr>
+                <w:rFonts w:ascii="Times New Roman" w:eastAsia="Times New Roman" w:hAnsi="Times New Roman" w:cs="Times New Roman"/>
+                <w:b/>
+                <w:bCs/>
+                <w:color w:val="000000" w:themeColor="text1"/>
+              </w:rPr>
+              <w:t>CHRISTOPHER HONEYWICK KALE</w:t>
+            </w:r>
+            <w:bookmarkStart w:id="0" w:name="_GoBack"/>
+            <w:bookmarkEnd w:id="0"/>
+            <w:r>
+              <w:rPr>
+                <w:rFonts w:ascii="Times New Roman" w:eastAsia="Times New Roman" w:hAnsi="Times New Roman" w:cs="Times New Roman"/>
+                <w:b/>
+                <w:bCs/>
+                <w:color w:val="000000" w:themeColor="text1"/>
+              </w:rPr>
+              <w:t>NGE</w:t>
+            </w:r>
           </w:p>
         </w:tc>
         <w:tc>
@@ -702,6 +757,15 @@
                 <w:color w:val="000000" w:themeColor="text1"/>
               </w:rPr>
             </w:pPr>
+            <w:r>
+              <w:rPr>
+                <w:rFonts w:ascii="Times New Roman" w:eastAsia="Times New Roman" w:hAnsi="Times New Roman" w:cs="Times New Roman"/>
+                <w:b/>
+                <w:bCs/>
+                <w:color w:val="000000" w:themeColor="text1"/>
+              </w:rPr>
+              <w:t>2025-04-03270</w:t>
+            </w:r>
           </w:p>
         </w:tc>
       </w:tr>
@@ -753,14 +817,23 @@
           </w:tcPr>
           <w:p>
             <w:pPr>
-              <w:spacing w:before="100" w:beforeAutospacing="1" w:after="100" w:afterAutospacing="1" w:line="360" w:lineRule="auto"/>
-              <w:rPr>
-                <w:rFonts w:ascii="Times New Roman" w:eastAsia="Times New Roman" w:hAnsi="Times New Roman" w:cs="Times New Roman"/>
-                <w:b/>
-                <w:bCs/>
-                <w:color w:val="000000" w:themeColor="text1"/>
-              </w:rPr>
-            </w:pPr>
+              <w:spacing w:line="360" w:lineRule="auto"/>
+              <w:rPr>
+                <w:rFonts w:ascii="Times New Roman" w:hAnsi="Times New Roman" w:cs="Times New Roman"/>
+                <w:b/>
+                <w:bCs/>
+                <w:color w:val="000000" w:themeColor="text1"/>
+              </w:rPr>
+            </w:pPr>
+            <w:r>
+              <w:rPr>
+                <w:rFonts w:ascii="Times New Roman" w:eastAsia="Times New Roman" w:hAnsi="Times New Roman" w:cs="Times New Roman"/>
+                <w:b/>
+                <w:bCs/>
+                <w:color w:val="000000" w:themeColor="text1"/>
+              </w:rPr>
+              <w:t>ABUBAKARY OMARY NDAMUNGU</w:t>
+            </w:r>
           </w:p>
         </w:tc>
         <w:tc>
@@ -775,14 +848,23 @@
           </w:tcPr>
           <w:p>
             <w:pPr>
-              <w:spacing w:before="100" w:beforeAutospacing="1" w:after="100" w:afterAutospacing="1" w:line="360" w:lineRule="auto"/>
-              <w:rPr>
-                <w:rFonts w:ascii="Times New Roman" w:eastAsia="Times New Roman" w:hAnsi="Times New Roman" w:cs="Times New Roman"/>
-                <w:b/>
-                <w:bCs/>
-                <w:color w:val="000000" w:themeColor="text1"/>
-              </w:rPr>
-            </w:pPr>
+              <w:spacing w:line="360" w:lineRule="auto"/>
+              <w:rPr>
+                <w:rFonts w:ascii="Times New Roman" w:hAnsi="Times New Roman" w:cs="Times New Roman"/>
+                <w:b/>
+                <w:bCs/>
+                <w:color w:val="000000" w:themeColor="text1"/>
+              </w:rPr>
+            </w:pPr>
+            <w:r>
+              <w:rPr>
+                <w:rFonts w:ascii="Times New Roman" w:eastAsia="Times New Roman" w:hAnsi="Times New Roman" w:cs="Times New Roman"/>
+                <w:b/>
+                <w:bCs/>
+                <w:color w:val="000000" w:themeColor="text1"/>
+              </w:rPr>
+              <w:t>2025-04-08565</w:t>
+            </w:r>
           </w:p>
         </w:tc>
       </w:tr>
@@ -842,28 +924,46 @@
                 <w:lang w:eastAsia="en-US" w:bidi="ar-SA"/>
               </w:rPr>
             </w:pPr>
-          </w:p>
-        </w:tc>
-        <w:tc>
-          <w:tcPr>
-            <w:tcW w:w="3676" w:type="dxa"/>
-            <w:tcBorders>
-              <w:top w:val="single" w:sz="4" w:space="0" w:color="000000"/>
-              <w:left w:val="single" w:sz="4" w:space="0" w:color="000000"/>
-              <w:bottom w:val="single" w:sz="4" w:space="0" w:color="000000"/>
-              <w:right w:val="single" w:sz="4" w:space="0" w:color="000000"/>
-            </w:tcBorders>
-          </w:tcPr>
-          <w:p>
-            <w:pPr>
-              <w:spacing w:before="100" w:beforeAutospacing="1" w:after="100" w:afterAutospacing="1" w:line="360" w:lineRule="auto"/>
+            <w:r>
               <w:rPr>
                 <w:rFonts w:ascii="Times New Roman" w:eastAsia="Times New Roman" w:hAnsi="Times New Roman" w:cs="Times New Roman"/>
                 <w:b/>
                 <w:color w:val="000000"/>
                 <w:lang w:eastAsia="en-US" w:bidi="ar-SA"/>
               </w:rPr>
-            </w:pPr>
+              <w:t>BEATRICE HARRY MUTAKI</w:t>
+            </w:r>
+          </w:p>
+        </w:tc>
+        <w:tc>
+          <w:tcPr>
+            <w:tcW w:w="3676" w:type="dxa"/>
+            <w:tcBorders>
+              <w:top w:val="single" w:sz="4" w:space="0" w:color="000000"/>
+              <w:left w:val="single" w:sz="4" w:space="0" w:color="000000"/>
+              <w:bottom w:val="single" w:sz="4" w:space="0" w:color="000000"/>
+              <w:right w:val="single" w:sz="4" w:space="0" w:color="000000"/>
+            </w:tcBorders>
+          </w:tcPr>
+          <w:p>
+            <w:pPr>
+              <w:spacing w:before="100" w:beforeAutospacing="1" w:after="100" w:afterAutospacing="1" w:line="360" w:lineRule="auto"/>
+              <w:rPr>
+                <w:rFonts w:ascii="Times New Roman" w:eastAsia="Times New Roman" w:hAnsi="Times New Roman" w:cs="Times New Roman"/>
+                <w:b/>
+                <w:color w:val="000000"/>
+                <w:lang w:eastAsia="en-US" w:bidi="ar-SA"/>
+              </w:rPr>
+            </w:pPr>
+            <w:r>
+              <w:rPr>
+                <w:rFonts w:ascii="Times New Roman" w:eastAsia="Times New Roman" w:hAnsi="Times New Roman" w:cs="Times New Roman"/>
+                <w:b/>
+                <w:color w:val="000000"/>
+                <w:lang w:eastAsia="en-US" w:bidi="ar-SA"/>
+              </w:rPr>
+              <w:t>2025-04-07852</w:t>
+            </w:r>
           </w:p>
         </w:tc>
       </w:tr>
@@ -923,28 +1023,46 @@
                 <w:lang w:eastAsia="en-US" w:bidi="ar-SA"/>
               </w:rPr>
             </w:pPr>
-          </w:p>
-        </w:tc>
-        <w:tc>
-          <w:tcPr>
-            <w:tcW w:w="3676" w:type="dxa"/>
-            <w:tcBorders>
-              <w:top w:val="single" w:sz="4" w:space="0" w:color="000000"/>
-              <w:left w:val="single" w:sz="4" w:space="0" w:color="000000"/>
-              <w:bottom w:val="single" w:sz="4" w:space="0" w:color="000000"/>
-              <w:right w:val="single" w:sz="4" w:space="0" w:color="000000"/>
-            </w:tcBorders>
-          </w:tcPr>
-          <w:p>
-            <w:pPr>
-              <w:spacing w:before="100" w:beforeAutospacing="1" w:after="100" w:afterAutospacing="1" w:line="360" w:lineRule="auto"/>
+            <w:r>
               <w:rPr>
                 <w:rFonts w:ascii="Times New Roman" w:eastAsia="Times New Roman" w:hAnsi="Times New Roman" w:cs="Times New Roman"/>
                 <w:b/>
                 <w:color w:val="000000"/>
                 <w:lang w:eastAsia="en-US" w:bidi="ar-SA"/>
               </w:rPr>
-            </w:pPr>
+              <w:t>RUKIA KANAL SENGA</w:t>
+            </w:r>
+          </w:p>
+        </w:tc>
+        <w:tc>
+          <w:tcPr>
+            <w:tcW w:w="3676" w:type="dxa"/>
+            <w:tcBorders>
+              <w:top w:val="single" w:sz="4" w:space="0" w:color="000000"/>
+              <w:left w:val="single" w:sz="4" w:space="0" w:color="000000"/>
+              <w:bottom w:val="single" w:sz="4" w:space="0" w:color="000000"/>
+              <w:right w:val="single" w:sz="4" w:space="0" w:color="000000"/>
+            </w:tcBorders>
+          </w:tcPr>
+          <w:p>
+            <w:pPr>
+              <w:spacing w:before="100" w:beforeAutospacing="1" w:after="100" w:afterAutospacing="1" w:line="360" w:lineRule="auto"/>
+              <w:rPr>
+                <w:rFonts w:ascii="Times New Roman" w:eastAsia="Times New Roman" w:hAnsi="Times New Roman" w:cs="Times New Roman"/>
+                <w:b/>
+                <w:color w:val="000000"/>
+                <w:lang w:eastAsia="en-US" w:bidi="ar-SA"/>
+              </w:rPr>
+            </w:pPr>
+            <w:r>
+              <w:rPr>
+                <w:rFonts w:ascii="Times New Roman" w:eastAsia="Times New Roman" w:hAnsi="Times New Roman" w:cs="Times New Roman"/>
+                <w:b/>
+                <w:color w:val="000000"/>
+                <w:lang w:eastAsia="en-US" w:bidi="ar-SA"/>
+              </w:rPr>
+              <w:t>2025-04-10536</w:t>
+            </w:r>
           </w:p>
         </w:tc>
       </w:tr>
@@ -1076,24 +1194,35 @@
     <w:p>
       <w:pPr>
         <w:spacing w:line="360" w:lineRule="auto"/>
-        <w:jc w:val="center"/>
         <w:rPr>
           <w:rFonts w:ascii="Times New Roman" w:hAnsi="Times New Roman" w:cs="Times New Roman"/>
           <w:b/>
         </w:rPr>
       </w:pPr>
-      <w:bookmarkStart w:id="0" w:name="_GoBack"/>
-      <w:bookmarkEnd w:id="0"/>
-    </w:p>
-    <w:p>
-      <w:pPr>
-        <w:spacing w:line="360" w:lineRule="auto"/>
-        <w:jc w:val="center"/>
+      <w:r>
         <w:rPr>
           <w:rFonts w:ascii="Times New Roman" w:hAnsi="Times New Roman" w:cs="Times New Roman"/>
           <w:b/>
         </w:rPr>
-      </w:pPr>
+        <w:t xml:space="preserve">Link for the git page : </w:t>
+      </w:r>
+      <w:hyperlink r:id="rId6" w:history="1">
+        <w:r>
+          <w:rPr>
+            <w:rStyle w:val="Hyperlink"/>
+            <w:rFonts w:ascii="Times New Roman" w:hAnsi="Times New Roman" w:cs="Times New Roman"/>
+            <w:b/>
+          </w:rPr>
+          <w:t>https://someone714.github.io/Assignment1/</w:t>
+        </w:r>
+      </w:hyperlink>
+      <w:r>
+        <w:rPr>
+          <w:rFonts w:ascii="Times New Roman" w:hAnsi="Times New Roman" w:cs="Times New Roman"/>
+          <w:b/>
+        </w:rPr>
+        <w:t xml:space="preserve"> </w:t>
+      </w:r>
     </w:p>
     <w:sectPr>
       <w:pgSz w:w="12240" w:h="15840"/>
@@ -1873,6 +2002,17 @@
       <w:szCs w:val="21"/>
     </w:rPr>
   </w:style>
+  <w:style w:type="character" w:styleId="Hyperlink">
+    <w:name w:val="Hyperlink"/>
+    <w:basedOn w:val="DefaultParagraphFont"/>
+    <w:uiPriority w:val="99"/>
+    <w:unhideWhenUsed/>
+    <w:rsid w:val="0033665D"/>
+    <w:rPr>
+      <w:color w:val="0563C1" w:themeColor="hyperlink"/>
+      <w:u w:val="single"/>
+    </w:rPr>
+  </w:style>
 </w:styles>
 </file>
 

</xml_diff>